<commit_message>
Elabora Resumo e Resultados do iGovTI 2026, insere referencias a graficos por esfera e adiciona scripts de automacao e validacao
</commit_message>
<xml_diff>
--- a/02-Execucao/04-Matriz_Achados/01-Matriz de Achados iGovTI 2026 - revisada.docx
+++ b/02-Execucao/04-Matriz_Achados/01-Matriz de Achados iGovTI 2026 - revisada.docx
@@ -6069,6 +6069,25 @@
               <w:t xml:space="preserve"> designação de agentes públicos para funções essenciais, observados atribuições, formação, segregação de funções e inexistência de vínculos que comprometam a atuação.</w:t>
             </w:r>
           </w:p>
+          <w:p/>
+          <w:p>
+            <w:r>
+              <w:rPr>
+                <w:rFonts w:ascii="Arial" w:hAnsi="Arial"/>
+                <w:b/>
+                <w:sz w:val="18"/>
+              </w:rPr>
+              <w:t>Instrução Normativa SGD/ME nº 94, de 23 de dezembro de 2022, art. 1º, § 1º:</w:t>
+            </w:r>
+            <w:r>
+              <w:rPr>
+                <w:rFonts w:ascii="Arial" w:hAnsi="Arial"/>
+                <w:b w:val="0"/>
+                <w:sz w:val="18"/>
+              </w:rPr>
+              <w:t xml:space="preserve"> como referência de boa prática, a aplicação de ritos formais de contratação de TIC pode ser facultada para contratações diretas por dispensa em razão do valor (inciso II do art. 75 da Lei nº 14.133/2021), indicando a possibilidade de fluxos simplificados para aquisições de baixa complexidade ou valor.</w:t>
+            </w:r>
+          </w:p>
         </w:tc>
         <w:tc>
           <w:tcPr>
@@ -6466,7 +6485,7 @@
                 <w:sz w:val="18"/>
                 <w:szCs w:val="18"/>
               </w:rPr>
-              <w:t xml:space="preserve"> para que estabeleça a submissão das contratações de TIC à análise prévia e à aprovação técnica da área de TIC, inclusive quando demandadas por outras áreas, de modo a verificar a compatibilidade da solução com os padrões tecnológicos, os requisitos institucionais, a segurança da informação e a arquitetura existente.</w:t>
+              <w:t xml:space="preserve"> para que estabeleça a submissão das contratações de TIC à análise prévia e à aprovação técnica da área de TIC, inclusive quando demandadas por outras áreas, de modo a verificar a compatibilidade da solução com os padrões tecnológicos, os requisitos institucionais, a segurança da informação e a arquitetura existente, facultando a adoção de fluxos simplificados ou a dispensa de parecer detalhado para contratações diretas por dispensa em razão do valor (baixo valor) ou de baixa complexidade técnica, mediante critérios objetivos ou catálogos de soluções padronizadas.</w:t>
             </w:r>
           </w:p>
           <w:p>

</xml_diff>